<commit_message>
Correct the product name to Agentic Integration Builder
The previous commit used "Agentic Interoperability Builder". The correct
name is Agentic Integration Builder (AIB). Straight swap across 22 files:
screens, LLM-facing prose, code comments, README, all docs/*.md, and the
regenerated .docx for the specification and canonical PRD.

Guards from the previous rename still hold: "IRIS for Health Interop
Editor" in observer/index.html is untouched (IRIS for Health product plus
the Interop Editor page, not the agent), and docs/PRD.md keeps its
historical "Health Interop AI Copilot" title.

No identifiers changed -- classes, package, parameters and the interop
chatbot key are as they were.

Verified: zero occurrences of the wrong name; Chatbot, FHIRInterop,
ChatService and Transform recompile clean; chat screen shows the correct
name in the brand title, sign-in overlay and browser tab.

Co-Authored-By: Claude Opus 4.8 <noreply@anthropic.com>
</commit_message>
<xml_diff>
--- a/docs/Integration_Spec_Questionnaire_Specification.docx
+++ b/docs/Integration_Spec_Questionnaire_Specification.docx
@@ -30,7 +30,7 @@
           <w:i/>
           <w:color w:val="555555"/>
         </w:rPr>
-        <w:t xml:space="preserve"> Agentic Interoperability Builder (AIB)</w:t>
+        <w:t xml:space="preserve"> Agentic Integration Builder (AIB)</w:t>
       </w:r>
     </w:p>
     <w:p>
@@ -216,7 +216,7 @@
     </w:p>
     <w:p>
       <w:r>
-        <w:t>The Agentic Interoperability Builder made building fast — an engineer describes an interface and the agent constructs it. That moved the bottleneck upstream. The agent can only build what it has been told, and what it is told is routinely incomplete in exactly the places that matter.</w:t>
+        <w:t>The Agentic Integration Builder made building fast — an engineer describes an interface and the agent constructs it. That moved the bottleneck upstream. The agent can only build what it has been told, and what it is told is routinely incomplete in exactly the places that matter.</w:t>
       </w:r>
     </w:p>
     <w:p>

</xml_diff>